<commit_message>
release: freeze Auto-Tune Studio 0.2.1
</commit_message>
<xml_diff>
--- a/docs/Auto-Tune-Installation-Manual.docx
+++ b/docs/Auto-Tune-Installation-Manual.docx
@@ -21,15 +21,12 @@
         <w:jc w:val="center"/>
       </w:pPr>
       <w:r>
-        <w:rPr>
-          <w:i/>
-        </w:rPr>
-        <w:t>Version 0.2.0 | 26 September 2026</w:t>
+        <w:t>Version 0.2.1 | 29 September 2026 | Stable freeze</w:t>
       </w:r>
     </w:p>
     <w:p>
       <w:r>
-        <w:t>The official online installation paths are the accepted Docker GPU image on GitHub Container Registry and a controlled source installation. The fully offline Windows ZIP has passed acceptance testing but is available only for private evaluation from Aika; it is not published as a public download. Every path requires an available NVIDIA GPU, and CPU fallback is not provided.</w:t>
+        <w:t>The official online installation paths are the accepted Docker GPU image on GitHub Container Registry and a controlled source installation. The Windows ZIP has passed private acceptance testing but is not published as a public download. First installation and first training require network access, and restricted networks need a working VPN. Every path requires an available NVIDIA GPU; CPU fallback is not provided.</w:t>
       </w:r>
     </w:p>
     <w:p>
@@ -61,7 +58,7 @@
         <w:pStyle w:val="ListBullet"/>
       </w:pPr>
       <w:r>
-        <w:t>Windows offline ZIP (private evaluation): for a standalone Windows 10 or 11 GPU workstation. Contact Aika for the matching package and SHA-256 information.</w:t>
+        <w:t>Windows ZIP (private evaluation): for a standalone Windows 10 or 11 GPU workstation. Contact Aika for the matching package and SHA-256 information.</w:t>
       </w:r>
     </w:p>
     <w:p>
@@ -113,6 +110,14 @@
       </w:r>
     </w:p>
     <w:p>
+      <w:pPr>
+        <w:pStyle w:val="ListBullet"/>
+      </w:pPr>
+      <w:r>
+        <w:t>Keep the network available during the first Windows or Docker installation and the first training run. Use a working VPN where direct access is restricted so Ultralytics can download first-use weights. LLM analysis and tuning require continued access to the external API.</w:t>
+      </w:r>
+    </w:p>
+    <w:p>
       <w:r>
         <w:t>For private Windows delivery, verify the exact package size and full SHA-256 supplied by Aika before extracting it. Do not use packages obtained from unofficial mirrors or third parties.</w:t>
       </w:r>
@@ -122,7 +127,7 @@
         <w:pStyle w:val="Heading1"/>
       </w:pPr>
       <w:r>
-        <w:t>3 Windows Offline ZIP Installation (Private Evaluation)</w:t>
+        <w:t>3 Windows ZIP Installation (Private Evaluation)</w:t>
       </w:r>
     </w:p>
     <w:p>
@@ -132,7 +137,7 @@
     </w:p>
     <w:p>
       <w:r>
-        <w:t>1. Extract AutoTuneStudio-Setup-0.2.0.zip to a normal folder. Do not run scripts from an archive preview.</w:t>
+        <w:t>1. Extract AutoTuneStudio-Setup-0.2.1.zip to a normal folder. Do not run scripts from an archive preview.</w:t>
       </w:r>
     </w:p>
     <w:p>
@@ -349,6 +354,24 @@
       </w:r>
     </w:p>
     <w:p>
+      <w:pPr/>
+      <w:r>
+        <w:t>The offline Docker delivery has two required files. The image TAR contains the runnable image. The source/configuration ZIP provides compose.yaml, controlled directory mappings, and startup configuration. Extract the ZIP and run Compose from the directory that directly contains compose.yaml; importing the image alone does not provide a Compose configuration.</w:t>
+      </w:r>
+    </w:p>
+    <w:p>
+      <w:pPr/>
+      <w:r>
+        <w:t>Offline order: verify both files, load the image, tag it as auto-tune:local, extract the configuration ZIP, enter its root directory, then run docker compose up -d --no-build.</w:t>
+      </w:r>
+    </w:p>
+    <w:p>
+      <w:pPr/>
+      <w:r>
+        <w:t>Online pull: docker pull ghcr.io/luzhaohao/auto-tune-studio:0.2.1; docker tag ghcr.io/luzhaohao/auto-tune-studio:0.2.1 auto-tune:local; docker compose up -d --no-build.</w:t>
+      </w:r>
+    </w:p>
+    <w:p>
       <w:r>
         <w:t>Recommended online installation from GitHub Container Registry:</w:t>
       </w:r>
@@ -358,36 +381,16 @@
         <w:ind w:left="360"/>
       </w:pPr>
       <w:r>
-        <w:rPr>
-          <w:rFonts w:ascii="Consolas" w:hAnsi="Consolas"/>
-          <w:sz w:val="18"/>
-        </w:rPr>
-        <w:t>docker pull ghcr.io/luzhaohao/auto-tune-studio:0.2.0</w:t>
-      </w:r>
-      <w:r>
+        <w:t>docker pull ghcr.io/luzhaohao/auto-tune-studio:0.2.1</w:t>
         <w:br/>
-      </w:r>
-      <w:r>
-        <w:rPr>
-          <w:rFonts w:ascii="Consolas" w:hAnsi="Consolas"/>
-          <w:sz w:val="18"/>
-        </w:rPr>
-        <w:t>docker tag ghcr.io/luzhaohao/auto-tune-studio:0.2.0 auto-tune:local</w:t>
-      </w:r>
-      <w:r>
+        <w:t>docker tag ghcr.io/luzhaohao/auto-tune-studio:0.2.1 auto-tune:local</w:t>
         <w:br/>
-      </w:r>
-      <w:r>
-        <w:rPr>
-          <w:rFonts w:ascii="Consolas" w:hAnsi="Consolas"/>
-          <w:sz w:val="18"/>
-        </w:rPr>
-        <w:t>docker compose up -d</w:t>
+        <w:t>docker compose up -d --no-build</w:t>
       </w:r>
     </w:p>
     <w:p>
       <w:r>
-        <w:t>For a fully offline host, obtain the image archive through an approved private delivery channel, verify its checksum, and import it:</w:t>
+        <w:t>If the host cannot access GHCR directly, obtain the image archive through an approved private delivery channel, verify its checksum, and import it:</w:t>
       </w:r>
     </w:p>
     <w:p>
@@ -395,31 +398,11 @@
         <w:ind w:left="360"/>
       </w:pPr>
       <w:r>
-        <w:rPr>
-          <w:rFonts w:ascii="Consolas" w:hAnsi="Consolas"/>
-          <w:sz w:val="18"/>
-        </w:rPr>
-        <w:t>docker load -i AutoTuneStudio-Docker-0.2.0-image.tar</w:t>
-      </w:r>
-      <w:r>
+        <w:t>docker load -i AutoTuneStudio-Docker-0.2.1-image.tar</w:t>
         <w:br/>
-      </w:r>
-      <w:r>
-        <w:rPr>
-          <w:rFonts w:ascii="Consolas" w:hAnsi="Consolas"/>
-          <w:sz w:val="18"/>
-        </w:rPr>
-        <w:t>docker image inspect auto-tune:0.2.0</w:t>
-      </w:r>
-      <w:r>
+        <w:t>docker image inspect auto-tune:0.2.1</w:t>
         <w:br/>
-      </w:r>
-      <w:r>
-        <w:rPr>
-          <w:rFonts w:ascii="Consolas" w:hAnsi="Consolas"/>
-          <w:sz w:val="18"/>
-        </w:rPr>
-        <w:t>docker tag auto-tune:0.2.0 auto-tune:local</w:t>
+        <w:t>docker tag auto-tune:0.2.1 auto-tune:local</w:t>
       </w:r>
     </w:p>
     <w:p>
@@ -696,36 +679,21 @@
         <w:ind w:left="360"/>
       </w:pPr>
       <w:r>
-        <w:rPr>
-          <w:rFonts w:ascii="Consolas" w:hAnsi="Consolas"/>
-          <w:sz w:val="18"/>
-        </w:rPr>
-        <w:t>docker compose up -d</w:t>
-      </w:r>
-      <w:r>
+        <w:t>docker compose up -d --no-build</w:t>
         <w:br/>
-      </w:r>
-      <w:r>
-        <w:rPr>
-          <w:rFonts w:ascii="Consolas" w:hAnsi="Consolas"/>
-          <w:sz w:val="18"/>
-        </w:rPr>
         <w:t>docker compose ps</w:t>
-      </w:r>
-      <w:r>
         <w:br/>
-      </w:r>
-      <w:r>
-        <w:rPr>
-          <w:rFonts w:ascii="Consolas" w:hAnsi="Consolas"/>
-          <w:sz w:val="18"/>
-        </w:rPr>
         <w:t>curl http://127.0.0.1:8000/healthz</w:t>
       </w:r>
     </w:p>
     <w:p>
       <w:r>
         <w:t>Expected response: {"status":"ok","product":"auto-tune-studio"}. Confirm healthy status, correct port mapping, NVIDIA GPU reservation, and 1 GiB shared memory.</w:t>
+      </w:r>
+    </w:p>
+    <w:p>
+      <w:r>
+        <w:t>A complete first-run check verifies healthy container status, the health endpoint, the web page, saved API connection, mounted datasets and weights, NVIDIA GPU visibility, and one minimal 1-epoch standard training. For full business acceptance, also run a minimal HPO study, formal training with the best HPO parameters, and one LLM tuning flow.</w:t>
       </w:r>
     </w:p>
     <w:p>

</xml_diff>